<commit_message>
Re-synthesize Odeme Sistemleri audio and update exact timestamps
</commit_message>
<xml_diff>
--- a/odemesistemleri.docx
+++ b/odemesistemleri.docx
@@ -4,17 +4,17 @@
   <w:body>
     <w:p>
       <w:r>
-        <w:t xml:space="preserve">BÖLÜM V: ÖDEME SİSTEMLERİ </w:t>
-      </w:r>
-    </w:p>
-    <w:p>
-      <w:r>
-        <w:t>1. KREDİ KARTLARI ÜRÜN ÖZELLİKLERİ</w:t>
-      </w:r>
-    </w:p>
-    <w:p>
-      <w:r>
-        <w:t>* 1.1. Worldpuan:</w:t>
+        <w:t xml:space="preserve">ÖDEME SİSTEMLERİ </w:t>
+      </w:r>
+    </w:p>
+    <w:p>
+      <w:r>
+        <w:t>KREDİ KARTLARI ÜRÜN ÖZELLİKLERİ</w:t>
+      </w:r>
+    </w:p>
+    <w:p>
+      <w:r>
+        <w:t>*Worldpuan:</w:t>
       </w:r>
     </w:p>
     <w:p>
@@ -30,7 +30,7 @@
     <w:p/>
     <w:p>
       <w:r>
-        <w:t>* 1.2. Temassız Özelliği ve 1.16. Mobil Temassız Ödeme:</w:t>
+        <w:t>* Temassız Özelliği ve 1.16. Mobil Temassız Ödeme:</w:t>
       </w:r>
     </w:p>
     <w:p>
@@ -41,7 +41,7 @@
     <w:p/>
     <w:p>
       <w:r>
-        <w:t>* 1.3. Nakite Taksit ve 1.4. Peşine Taksit:</w:t>
+        <w:t>* Nakite Taksit ve 1.4. Peşine Taksit:</w:t>
       </w:r>
     </w:p>
     <w:p>
@@ -57,7 +57,7 @@
     <w:p/>
     <w:p>
       <w:r>
-        <w:t>* 1.5. Sözünle Kazan:</w:t>
+        <w:t>* Sözünle Kazan:</w:t>
       </w:r>
     </w:p>
     <w:p>
@@ -68,7 +68,7 @@
     <w:p/>
     <w:p>
       <w:r>
-        <w:t>* 1.6. Otomatik Fatura Ödeme (Bireysel vs. Ticari Farkı):</w:t>
+        <w:t>* Otomatik Fatura Ödeme (Bireysel vs. Ticari Farkı):</w:t>
       </w:r>
     </w:p>
     <w:p>
@@ -85,7 +85,7 @@
     <w:p>
       <w:r>
         <w:lastRenderedPageBreak/>
-        <w:t>* 1.13. Kredi Kartına Hesap Bağlama:</w:t>
+        <w:t>*Kredi Kartına Hesap Bağlama:</w:t>
       </w:r>
     </w:p>
     <w:p>
@@ -106,7 +106,7 @@
     <w:p/>
     <w:p>
       <w:r>
-        <w:t>* 1.14. Sanal Limit ve Sanal Kredi Kartı:</w:t>
+        <w:t>* Sanal Limit ve Sanal Kredi Kartı:</w:t>
       </w:r>
     </w:p>
     <w:p>
@@ -132,7 +132,7 @@
     <w:p/>
     <w:p>
       <w:r>
-        <w:t>* 1.15. Mobil Bankacılık Cepte Kazan ve 1.17. Karekod (QR) Ödeme:</w:t>
+        <w:t>* Mobil Bankacılık Cepte Kazan ve 1.17. Karekod (QR) Ödeme:</w:t>
       </w:r>
     </w:p>
     <w:p>
@@ -149,7 +149,7 @@
     <w:p/>
     <w:p>
       <w:r>
-        <w:t>2. KREDİ KARTI ÇEŞİTLERİ VE LİMİT / AYRICALIK KRİTERLERİ</w:t>
+        <w:t>KREDİ KARTI ÇEŞİTLERİ VE LİMİT / AYRICALIK KRİTERLERİ</w:t>
       </w:r>
     </w:p>
     <w:p>
@@ -159,7 +159,7 @@
     </w:p>
     <w:p>
       <w:r>
-        <w:t>* 2.1. Klasik ve Gold Kredi Kartları:</w:t>
+        <w:t>* Klasik ve Gold Kredi Kartları:</w:t>
       </w:r>
     </w:p>
     <w:p>
@@ -175,7 +175,7 @@
     <w:p/>
     <w:p>
       <w:r>
-        <w:t>* 2.2. Öğretmenim, ASES ve Kamusen Kredi Kartları:</w:t>
+        <w:t>*Öğretmenim, ASES ve Kamusen Kredi Kartları:</w:t>
       </w:r>
     </w:p>
     <w:p>
@@ -202,7 +202,7 @@
     <w:p/>
     <w:p>
       <w:r>
-        <w:t>* 2.3. VakıfBank Platinum Kredi Kartı:</w:t>
+        <w:t>* VakıfBank Platinum Kredi Kartı:</w:t>
       </w:r>
     </w:p>
     <w:p>
@@ -223,7 +223,7 @@
     <w:p/>
     <w:p>
       <w:r>
-        <w:t>* 2.8. Platinum Plus ve Platinum Plus Metal Kredi Kartı:</w:t>
+        <w:t>* Platinum Plus ve Platinum Plus Metal Kredi Kartı:</w:t>
       </w:r>
     </w:p>
     <w:p>
@@ -259,7 +259,7 @@
     <w:p/>
     <w:p>
       <w:r>
-        <w:t>* 2.10. Private Card / Private Metal Card ve 2.11. Reserve Card:</w:t>
+        <w:t>* Private Card / Private Metal Card ve 2.11. Reserve Card:</w:t>
       </w:r>
     </w:p>
     <w:p>
@@ -284,7 +284,7 @@
     <w:p/>
     <w:p>
       <w:r>
-        <w:t>* 2.13. Taraftar Kredi Kartları:</w:t>
+        <w:t>* Taraftar Kredi Kartları:</w:t>
       </w:r>
     </w:p>
     <w:p>
@@ -295,7 +295,7 @@
     <w:p/>
     <w:p>
       <w:r>
-        <w:t>* 2.14. Like Card ve 2.15. Kampüs Kart:</w:t>
+        <w:t>* Like Card ve 2.15. Kampüs Kart:</w:t>
       </w:r>
     </w:p>
     <w:p>
@@ -311,7 +311,7 @@
     <w:p/>
     <w:p>
       <w:r>
-        <w:t>* 2.16. Express, 2.17. Click, 2.18. Recycle ve 2.19. Emekli Kart:</w:t>
+        <w:t>* Express, 2.17. Click, 2.18. Recycle ve 2.19. Emekli Kart:</w:t>
       </w:r>
     </w:p>
     <w:p>
@@ -362,10 +362,9 @@
       </w:r>
     </w:p>
     <w:p/>
-    <w:p/>
-    <w:p>
-      <w:r>
-        <w:t>3. ÖN ÖDEMELİ KARTLAR VE BANKOMAT KARTLAR</w:t>
+    <w:p>
+      <w:r>
+        <w:t>ÖN ÖDEMELİ KARTLAR VE BANKOMAT KARTLAR</w:t>
       </w:r>
     </w:p>
     <w:p>
@@ -427,67 +426,254 @@
     </w:p>
     <w:p>
       <w:r>
+        <w:t xml:space="preserve">  - Şubeden ödeme gerekirse (2024-168 Tebliğ) talep kaydı açılır ve iş birimi yanıtına göre "Prepaid Para Çek" ekranından Kart Hamiline, Vasisine veya Velisine ödeme yapılır.</w:t>
+      </w:r>
+    </w:p>
+    <w:p/>
+    <w:p>
+      <w:r>
+        <w:t>* Bankomat Kartlar Genel Özellikleri ve Limitleri:</w:t>
+      </w:r>
+    </w:p>
+    <w:p>
+      <w:r>
+        <w:t xml:space="preserve">  - POS ve internet alışverişi bağlı ana hesap olan VADESİZ TL hesabın kullanılabilir bakiyesi üzerinden yapılır.</w:t>
+      </w:r>
+    </w:p>
+    <w:p>
+      <w:r>
+        <w:t xml:space="preserve">  - Bankomat Para: Alt limitleri 10 TL ile 100 TL arasında 10'un katları şeklinde müşteri tarafından belirlenir ve bu limite ulaşınca hesaba nakit aktarılır (her ay düzenlenen kampanyalardan birine katılmak kartı sisteme dahil eder).</w:t>
+      </w:r>
+    </w:p>
+    <w:p>
+      <w:r>
+        <w:t xml:space="preserve">  - ATM Günlük Para Çekme Limiti: Günlük 10.000 TL olup, masraf karşılığında limit üstü 10.000 TL daha çekilebilir.</w:t>
+      </w:r>
+    </w:p>
+    <w:p>
+      <w:r>
+        <w:t xml:space="preserve">  - YURT DIŞI KULLANIM ŞARTI: Yurt dışı işlemler sadece vadesiz TL hesabı üzerinden yapılır; bağlı TL hesabında yeterli bakiye olması ve kartın TÜRKİYE'DEKİ VAKIFBANK ATM'SİNDEN EN AZ BİR KERE KULLANILMIŞ OLMASI gerekmektedir.</w:t>
+      </w:r>
+    </w:p>
+    <w:p/>
+    <w:p>
+      <w:r>
+        <w:t>* Bankomat Kart Türleri İnce Noktaları:</w:t>
+      </w:r>
+    </w:p>
+    <w:p>
+      <w:r>
+        <w:t xml:space="preserve">  - Like Bankomat ve Genç Bankomat Kart: 24 YAŞ ALTI gençler ve çocuklara sunulur.</w:t>
+      </w:r>
+    </w:p>
+    <w:p>
+      <w:r>
+        <w:t xml:space="preserve">  - Sanal Bankomat Kart: Vadesiz TL hesabına bağlıdır, fiziki kart yoktur, sadece internet alışverişlerinde kullanılır.</w:t>
+      </w:r>
+    </w:p>
+    <w:p>
+      <w:r>
+        <w:t xml:space="preserve">  - Anında Bankomat Kart: Şubelerden müşteri numarasına bağlanıp hemen teslim edilen isimsiz karttır; normal Bankomat karttan TEK FARKI EK KART OLARAK VERİLEMEMESİDİR.</w:t>
+      </w:r>
+    </w:p>
+    <w:p>
+      <w:r>
+        <w:t xml:space="preserve">  - Diğer Türler: Temassız Bankomat, Platinum/Platinum Plus/Private Bankomat (daha yüksek Bankomat Para oranı), Taraftar Bankomat ve Emekli Bankomat Kart.</w:t>
+      </w:r>
+    </w:p>
+    <w:p/>
+    <w:p/>
+    <w:p>
+      <w:r>
+        <w:t>KREDİ KARTI BAŞVURU, LİMİT VE OPERASYONEL İŞLEMLER</w:t>
+      </w:r>
+    </w:p>
+    <w:p>
+      <w:r>
+        <w:t>--------------------------------------------------------------------------------</w:t>
+      </w:r>
+    </w:p>
+    <w:p>
+      <w:r>
+        <w:t>*Kredi Kartı Başvuru Süreci:</w:t>
+      </w:r>
+    </w:p>
+    <w:p>
+      <w:r>
+        <w:t xml:space="preserve">  - Sadece geçerli bir kimlik belgesi (nüfus cüzdanı, ehliyet veya pasaport) aslı görülerek fotokopisi alınır; ikametgah, fatura, gelir belgesi alınması kaldırılmıştır.</w:t>
+      </w:r>
+    </w:p>
+    <w:p>
+      <w:r>
+        <w:t xml:space="preserve">  - İSTİSNA: Yabancı uyruklu müşterilerde ikamet izin belgesi veya çalışma izin belgesi istenebilmektedir.</w:t>
+      </w:r>
+    </w:p>
+    <w:p/>
+    <w:p>
+      <w:r>
         <w:lastRenderedPageBreak/>
-        <w:t xml:space="preserve">  - Şubeden ödeme gerekirse (2024-168 Tebliğ) talep kaydı açılır ve iş birimi yanıtına göre "Prepaid Para Çek" ekranından Kart Hamiline, Vasisine veya Velisine ödeme yapılır.</w:t>
-      </w:r>
-    </w:p>
-    <w:p/>
-    <w:p>
-      <w:r>
-        <w:t>* Bankomat Kartlar Genel Özellikleri ve Limitleri:</w:t>
-      </w:r>
-    </w:p>
-    <w:p>
-      <w:r>
-        <w:t xml:space="preserve">  - POS ve internet alışverişi bağlı ana hesap olan VADESİZ TL hesabın kullanılabilir bakiyesi üzerinden yapılır.</w:t>
-      </w:r>
-    </w:p>
-    <w:p>
-      <w:r>
-        <w:t xml:space="preserve">  - Bankomat Para: Alt limitleri 10 TL ile 100 TL arasında 10'un katları şeklinde müşteri tarafından belirlenir ve bu limite ulaşınca hesaba nakit aktarılır (her ay düzenlenen kampanyalardan birine katılmak kartı sisteme dahil eder).</w:t>
-      </w:r>
-    </w:p>
-    <w:p>
-      <w:r>
-        <w:t xml:space="preserve">  - ATM Günlük Para Çekme Limiti: Günlük 10.000 TL olup, masraf karşılığında limit üstü 10.000 TL daha çekilebilir.</w:t>
-      </w:r>
-    </w:p>
-    <w:p>
-      <w:r>
-        <w:t xml:space="preserve">  - YURT DIŞI KULLANIM ŞARTI: Yurt dışı işlemler sadece vadesiz TL hesabı üzerinden yapılır; bağlı TL hesabında yeterli bakiye olması ve kartın TÜRKİYE'DEKİ VAKIFBANK ATM'SİNDEN EN AZ BİR KERE KULLANILMIŞ OLMASI gerekmektedir.</w:t>
-      </w:r>
-    </w:p>
-    <w:p/>
-    <w:p>
-      <w:r>
-        <w:t>* Bankomat Kart Türleri İnce Noktaları:</w:t>
-      </w:r>
-    </w:p>
-    <w:p>
-      <w:r>
-        <w:t xml:space="preserve">  - Like Bankomat ve Genç Bankomat Kart: 24 YAŞ ALTI gençler ve çocuklara sunulur.</w:t>
-      </w:r>
-    </w:p>
-    <w:p>
-      <w:r>
-        <w:t xml:space="preserve">  - Sanal Bankomat Kart: Vadesiz TL hesabına bağlıdır, fiziki kart yoktur, sadece internet alışverişlerinde kullanılır.</w:t>
-      </w:r>
-    </w:p>
-    <w:p>
-      <w:r>
-        <w:t xml:space="preserve">  - Anında Bankomat Kart: Şubelerden müşteri numarasına bağlanıp hemen teslim edilen isimsiz karttır; normal Bankomat karttan TEK FARKI EK KART OLARAK VERİLEMEMESİDİR.</w:t>
-      </w:r>
-    </w:p>
-    <w:p>
-      <w:r>
-        <w:t xml:space="preserve">  - Diğer Türler: Temassız Bankomat, Platinum/Platinum Plus/Private Bankomat (daha yüksek Bankomat Para oranı), Taraftar Bankomat ve Emekli Bankomat Kart.</w:t>
-      </w:r>
-    </w:p>
-    <w:p/>
-    <w:p/>
-    <w:p>
-      <w:r>
-        <w:t>4. KREDİ KARTI BAŞVURU, LİMİT VE OPERASYONEL İŞLEMLER</w:t>
+        <w:t>* Kredi Kartı Limit Süreci, Yasal Sınırlar ve Yetkiler:</w:t>
+      </w:r>
+    </w:p>
+    <w:p>
+      <w:r>
+        <w:t xml:space="preserve">  - Limit değişikliklerinde müşteri talebi (DYS'ye dilekçe/form veya SMS onay kodu) zorunludur.</w:t>
+      </w:r>
+    </w:p>
+    <w:p>
+      <w:r>
+        <w:t xml:space="preserve">  - Sistem kontrollerinde son 20 GÜN (parametrik değer) içinde belirli ret sebepleriyle reddedilmiş başvuru olup olmadığına bakılır.</w:t>
+      </w:r>
+    </w:p>
+    <w:p>
+      <w:r>
+        <w:t xml:space="preserve">  - LKS (Limit Kontrol Sistemi) Yasal Sınırı (8 Ekim 2013 BDDK Kararı): İlk defa kredi kartı sahibi olacak kişinin tüm bankalardan toplam limiti; İLK YIL gelirinin 2 KATINI, İKİNCİ VE SONRAKİ YILLAR 4 KATINI aşamaz.</w:t>
+      </w:r>
+    </w:p>
+    <w:p>
+      <w:r>
+        <w:t xml:space="preserve">  - BANKAMIZ MENSUPLARI SINIRI: Bankamız mensuplarına, eş ve velayeti altındaki çocuklarına (Bankacılık Kanunu Md. 50) LKS toplamı gözetilerek gelirlerinin 3 KATI limit tahsisi yapılabilir.</w:t>
+      </w:r>
+    </w:p>
+    <w:p>
+      <w:r>
+        <w:t xml:space="preserve">  - Eksik Ödeme Sayacı / Ardışık Eksik Ödeme Sayacı: Bir takvim yılı içinde 3 kez (ardışıkta üst üste 3 kez) asgari ödeme tutarının ödenmemesi durumudur. Sayacı 3 ve üzerinde olan müşterinin LİMİT ARTIŞI YAPILAMAZ ve KARTLAR NAKİT ÇEKİME KAPATILIR (üst üste 3 kez ödenmeyenler mal ve hizmet alımına da kapatılır). Sayacın sıfırlanması için SON KESİLEN EKSTRE BORCUNUN (TL ve USD) TAMAMININ yatırılması gerekir.</w:t>
+      </w:r>
+    </w:p>
+    <w:p>
+      <w:r>
+        <w:t xml:space="preserve">  - Nakit / Kıymetli Maden Rehni İstisnası (25.09.2020 BDDK Düzenlemesi): Karşılığı nakit, nakit benzeri kıymet/hesap ve kıymetli maden olması durumunda, karşılık tutarı geçmemek ve rehin sözleşmesi yapılmak şartıyla GELİR BEYANI/TEYİDİ VE LKS SINIRLAMALARINA TABİ OLMAKSIZIN limit tespit edilebilir.</w:t>
+      </w:r>
+    </w:p>
+    <w:p>
+      <w:r>
+        <w:t xml:space="preserve">  - Kredi Kartı Tahsis Yetki Tablosu (Nakit Blokesiz / Nakit Blokeli):</w:t>
+      </w:r>
+    </w:p>
+    <w:p>
+      <w:r>
+        <w:t xml:space="preserve">    * Birim Müdürü: 0 - 3.500.000 TL (Blokesiz) | 18.500.000 TL (Blokeli)</w:t>
+      </w:r>
+    </w:p>
+    <w:p>
+      <w:r>
+        <w:t xml:space="preserve">    * Başkan: 3.500.001 TL - 7.500.000 TL (Blokesiz) | 18.500.001 TL - 37.500.000 TL (Blokeli)</w:t>
+      </w:r>
+    </w:p>
+    <w:p>
+      <w:r>
+        <w:t xml:space="preserve">    * Genel Müdür Yrd.: 7.500.001 TL - 15.000.000 TL (Blokesiz) | 37.500.001 TL - 75.000.000 TL (Blokeli)</w:t>
+      </w:r>
+    </w:p>
+    <w:p>
+      <w:r>
+        <w:t xml:space="preserve">    * Genel Müdür: 15.000.001 TL Üstü (Blokesiz) | 75.000.001 TL Üstü (Blokeli)</w:t>
+      </w:r>
+    </w:p>
+    <w:p/>
+    <w:p>
+      <w:r>
+        <w:t>* Yeniden Değerlendirme Şartları:</w:t>
+      </w:r>
+    </w:p>
+    <w:p>
+      <w:r>
+        <w:t xml:space="preserve">  - Müşterinin açık takibi olmamalı, başvuru/limit talebi SON 1 AY içerisinde yapılmış olmalı ve gerekçe açıkça belirtilmelidir.</w:t>
+      </w:r>
+    </w:p>
+    <w:p/>
+    <w:p>
+      <w:r>
+        <w:t>* Operasyonel İşlemler, İtiraz Süreleri ve Kurallar:</w:t>
+      </w:r>
+    </w:p>
+    <w:p>
+      <w:r>
+        <w:lastRenderedPageBreak/>
+        <w:t xml:space="preserve">  - 5464 Sayılı Kanun Zorunlu Süreleri: Kredi kartı iptalleri talep tarihinden itibaren 7 GÜN içinde gerçekleştirilmeli; müşteri itirazları 20 GÜN içinde yanıtlanmalıdır.</w:t>
+      </w:r>
+    </w:p>
+    <w:p>
+      <w:r>
+        <w:t xml:space="preserve">  - Kart Ücreti İtirazları: VIT "Kart Aidat İtirazı Yap" menüsünden değerlendirilir, müşteriye bilgi verilir ve AYRICA KAYIT ALINMAZ.</w:t>
+      </w:r>
+    </w:p>
+    <w:p>
+      <w:r>
+        <w:t xml:space="preserve">  -Nakit Çekim ve Harcama İtirazları:</w:t>
+      </w:r>
+    </w:p>
+    <w:p>
+      <w:r>
+        <w:t xml:space="preserve">    * Kart Hamili İtiraz Süresi: İşlemlere itiraz etme süresi EN FAZLA 120 GÜNDÜR (bilgilendirmeyi Kartlı Sistemler Takas İşlemleri Müdürlüğü yapar).</w:t>
+      </w:r>
+    </w:p>
+    <w:p>
+      <w:r>
+        <w:t xml:space="preserve">    * Üye İşyeri ve ATM İtirazları: VIT üzerinden şubelere iletilen kaydın cevaplanma süresi ORTALAMA 5 İŞ GÜNÜDÜR; süresinde dönüş yapılmazsa üye işyeri aleyhine sonuçlanır ve firma hesabından tahsil edilir.</w:t>
+      </w:r>
+    </w:p>
+    <w:p>
+      <w:r>
+        <w:t xml:space="preserve">  - Artı Bakiye Transferleri: VIT "Kredi Kartı Artı Bakiye Transferi" ekranından kart statüsü ve para birimi (TL/USD) ayrımı olmaksızın çekilir. Sistem reddederse VIT Müşteri Talep Yönetimi'nden Kartlı Sistemler Müşteri Hizmetleri Müdürlüğüne kayıt açılır; çözüm süresi AZAMİ 3 İŞ GÜNÜDÜR.</w:t>
+      </w:r>
+    </w:p>
+    <w:p>
+      <w:r>
+        <w:t xml:space="preserve">  - Kart İptali: Şubeler aynı gün VIT "Kart İptal Talebi Al" ekranından işleme alır; ancak TARIM KARTLARIN İPTALİ İÇİN Müşteri Talep Yönetiminden kayıt açılmalıdır.</w:t>
+      </w:r>
+    </w:p>
+    <w:p>
+      <w:r>
+        <w:t xml:space="preserve">  - Asgari Ödeme Oranları:</w:t>
+      </w:r>
+    </w:p>
+    <w:p>
+      <w:r>
+        <w:t xml:space="preserve">    * Bireysel Kredi Kartı: Limit 50.000 TL altında ise %20 | 50.000 TL üzeri ise %40</w:t>
+      </w:r>
+    </w:p>
+    <w:p>
+      <w:r>
+        <w:t xml:space="preserve">    * Ticari Kredi Kartı: Limit 5 Milyon TL'ye kadar ise %40 | 5 Milyon TL ve üzeri ise %50</w:t>
+      </w:r>
+    </w:p>
+    <w:p>
+      <w:r>
+        <w:t xml:space="preserve">    * Tarım Kartlar: %70</w:t>
+      </w:r>
+    </w:p>
+    <w:p>
+      <w:r>
+        <w:t xml:space="preserve">    * Mal/hizmet alımları ve nakit çekimlerde taksitlendirme süreleri; Cumhurbaşkanlığı Strateji ve Bütçe Başkanlığı, Hazine ve Maliye Bakanlığı ile Ticaret Bakanlığının görüşü alınarak BDDK (Kurul) tarafından belirlenir.</w:t>
+      </w:r>
+    </w:p>
+    <w:p>
+      <w:r>
+        <w:t xml:space="preserve">  - Kayıp/Çalıntı Sorumluluğu: Bildirimden önceki 24 SAAT İÇİNDE gerçekleşen hukuka aykırı kullanımdan doğan zararlardan kart hamili 150 TL İLE SINIRLI olmak üzere sorumludur; 24 saatten önce gerçekleşen işlemlerden kendisi sorumludur.</w:t>
+      </w:r>
+    </w:p>
+    <w:p>
+      <w:r>
+        <w:t xml:space="preserve">  - Yabancı Para (USD) Harcama ve Ödeme: Son ödeme tarihinde ödenmeyen/eksik ödenen USD borcu, SON ÖDEME TARİHİNDEN 1 İŞ GÜNÜ ÖNCEKİ TCMB DÖVİZ SATIŞ KURUNA %1 EKLENEREK TL'ye çevrilir ve hesap kesim tarihi valörüyle TL hesabına borç kaydedilir (son ödeme tarihi geçtikten sonra ödeme USD değil TL cinsinden yapılmalıdır).</w:t>
+      </w:r>
+    </w:p>
+    <w:p>
+      <w:r>
+        <w:t xml:space="preserve">  -  Para Yatırma: Kredi kartı limiti para yatırıldığı ANDA açılır; ek karta yapılan ödeme GÜN SONU itibarıyla asıl kart hesabına geçer.</w:t>
+      </w:r>
+    </w:p>
+    <w:p>
+      <w:r>
+        <w:lastRenderedPageBreak/>
+        <w:t xml:space="preserve">  -  Kart Dağıtım Kurye Ayrımı: Müşterilerin ev/iş adreslerine gönderilen kartlar KURYENET / AGT / PTT ile; şubelerimize gönderilmek üzere basılan kartlar ise DHL KARGO tarafından gönderilir.</w:t>
+      </w:r>
+    </w:p>
+    <w:p/>
+    <w:p/>
+    <w:p>
+      <w:r>
+        <w:t>ÜYE İŞYERİ YAPISI, TAKAS, WORLD MARKA PAYLAŞIMI VE POS TÜRLERİ</w:t>
       </w:r>
     </w:p>
     <w:p>
@@ -497,334 +683,143 @@
     </w:p>
     <w:p>
       <w:r>
-        <w:t>* 3.1. Kredi Kartı Başvuru Süreci:</w:t>
-      </w:r>
-    </w:p>
-    <w:p>
-      <w:r>
-        <w:t xml:space="preserve">  - Sadece geçerli bir kimlik belgesi (nüfus cüzdanı, ehliyet veya pasaport) aslı görülerek fotokopisi alınır; ikametgah, fatura, gelir belgesi alınması kaldırılmıştır.</w:t>
+        <w:t>* Üye İşyeri Takas Mekanizması:</w:t>
+      </w:r>
+    </w:p>
+    <w:p>
+      <w:r>
+        <w:t xml:space="preserve">  - Takas Komisyonu BKM tarafından aylık olarak belirlenir.</w:t>
+      </w:r>
+    </w:p>
+    <w:p>
+      <w:r>
+        <w:t xml:space="preserve">  - KURAL: Takas komisyonunu ÜYE İŞYERİ SAHİBİ BANKA (Acquirer), KART SAHİBİ BANKAYA (Issuer) öder.</w:t>
+      </w:r>
+    </w:p>
+    <w:p>
+      <w:r>
+        <w:t xml:space="preserve">  - Yurt içi takasta BKM ve TCMB yer alırken; yurt dışı takasta BKM ile birlikte Visa / MasterCard devreye girer.</w:t>
+      </w:r>
+    </w:p>
+    <w:p/>
+    <w:p>
+      <w:r>
+        <w:t>*  Üye İşyeri Çalışma Şartlarımız:</w:t>
+      </w:r>
+    </w:p>
+    <w:p>
+      <w:r>
+        <w:t xml:space="preserve">  - Tek Ödeme İşlemler: Komisyonlu (ertesi gün komisyon kesilerek), Valörlü (valör süresi beklenip komisyonsuz) veya Valör + Komisyonlu.</w:t>
+      </w:r>
+    </w:p>
+    <w:p>
+      <w:r>
+        <w:t xml:space="preserve">  - Taksitli İşlemler:</w:t>
+      </w:r>
+    </w:p>
+    <w:p>
+      <w:r>
+        <w:t xml:space="preserve">    * İskontolu İşlemler: Ertesi gün komisyonlu olarak işyeri hesabına yatırılır.</w:t>
+      </w:r>
+    </w:p>
+    <w:p>
+      <w:r>
+        <w:t xml:space="preserve">    * Valörlü İşlemler: İşyeri hesabına İLK TAKSİT 40 GÜN, takip eden taksitler de 40'AR GÜNLÜK PERİYOTLAR halinde yatırılır; ayrıca TİK (taksitli işlem komisyonu) tahsil edilmez.</w:t>
+      </w:r>
+    </w:p>
+    <w:p>
+      <w:r>
+        <w:t xml:space="preserve">  - İNCE NOKTA: Bankamız Ticari Kredi Kartları artı taksit kampanyalarından FAYDALANDIRILMAMAKTADIR. Ticari kartlarda sektörel taksit kısıtı uygulanmaz, genel taksit sınırına tabidir.</w:t>
+      </w:r>
+    </w:p>
+    <w:p/>
+    <w:p>
+      <w:r>
+        <w:t>*World Marka Paylaşımı ve 9. Üye İşyeri Yapısı:</w:t>
+      </w:r>
+    </w:p>
+    <w:p>
+      <w:r>
+        <w:t xml:space="preserve">  - Bankamız ile YKB arasındaki World anlaşması gereği BKM takas komisyon oranının altında bir takas komisyonu uygulanır.</w:t>
+      </w:r>
+    </w:p>
+    <w:p>
+      <w:r>
+        <w:t xml:space="preserve">  - PARAGRAF SONU TUZAĞI: Sadece YKB World Kartlar, VakıfBank World POS'larında World özellikli kabul edilir; AL BARAKA ve ANADOLUBANK World kartları VakıfBank World POS'larında World özellikli olarak KABUL EDİLEMEMEKTEDİR.</w:t>
       </w:r>
     </w:p>
     <w:p>
       <w:r>
         <w:lastRenderedPageBreak/>
-        <w:t xml:space="preserve">  - İSTİSNA: Yabancı uyruklu müşterilerde ikamet izin belgesi veya çalışma izin belgesi istenebilmektedir.</w:t>
-      </w:r>
-    </w:p>
-    <w:p/>
-    <w:p>
-      <w:r>
-        <w:t>* 3.2. Kredi Kartı Limit Süreci, Yasal Sınırlar ve Yetkiler:</w:t>
-      </w:r>
-    </w:p>
-    <w:p>
-      <w:r>
-        <w:t xml:space="preserve">  - Limit değişikliklerinde müşteri talebi (DYS'ye dilekçe/form veya SMS onay kodu) zorunludur.</w:t>
-      </w:r>
-    </w:p>
-    <w:p>
-      <w:r>
-        <w:t xml:space="preserve">  - Sistem kontrollerinde son 20 GÜN (parametrik değer) içinde belirli ret sebepleriyle reddedilmiş başvuru olup olmadığına bakılır.</w:t>
-      </w:r>
-    </w:p>
-    <w:p>
-      <w:r>
-        <w:t xml:space="preserve">  - LKS (Limit Kontrol Sistemi) Yasal Sınırı (8 Ekim 2013 BDDK Kararı): İlk defa kredi kartı sahibi olacak kişinin tüm bankalardan toplam limiti; İLK YIL gelirinin 2 KATINI, İKİNCİ VE SONRAKİ YILLAR 4 KATINI aşamaz.</w:t>
-      </w:r>
-    </w:p>
-    <w:p>
-      <w:r>
-        <w:t xml:space="preserve">  - BANKAMIZ MENSUPLARI SINIRI: Bankamız mensuplarına, eş ve velayeti altındaki çocuklarına (Bankacılık Kanunu Md. 50) LKS toplamı gözetilerek gelirlerinin 3 KATI limit tahsisi yapılabilir.</w:t>
-      </w:r>
-    </w:p>
-    <w:p>
-      <w:r>
-        <w:t xml:space="preserve">  - Eksik Ödeme Sayacı / Ardışık Eksik Ödeme Sayacı: Bir takvim yılı içinde 3 kez (ardışıkta üst üste 3 kez) asgari ödeme tutarının ödenmemesi durumudur. Sayacı 3 ve üzerinde olan müşterinin LİMİT ARTIŞI YAPILAMAZ ve KARTLAR NAKİT ÇEKİME KAPATILIR (üst üste 3 kez ödenmeyenler mal ve hizmet alımına da kapatılır). Sayacın sıfırlanması için SON KESİLEN EKSTRE BORCUNUN (TL ve USD) TAMAMININ yatırılması gerekir.</w:t>
-      </w:r>
-    </w:p>
-    <w:p>
-      <w:r>
-        <w:t xml:space="preserve">  - Nakit / Kıymetli Maden Rehni İstisnası (25.09.2020 BDDK Düzenlemesi): Karşılığı nakit, nakit benzeri kıymet/hesap ve kıymetli maden olması durumunda, karşılık tutarı geçmemek ve rehin sözleşmesi yapılmak şartıyla GELİR BEYANI/TEYİDİ VE LKS SINIRLAMALARINA TABİ OLMAKSIZIN limit tespit edilebilir.</w:t>
-      </w:r>
-    </w:p>
-    <w:p>
-      <w:r>
-        <w:t xml:space="preserve">  - Kredi Kartı Tahsis Yetki Tablosu (Nakit Blokesiz / Nakit Blokeli):</w:t>
-      </w:r>
-    </w:p>
-    <w:p>
-      <w:r>
-        <w:t xml:space="preserve">    * Birim Müdürü: 0 - 3.500.000 TL (Blokesiz) | 18.500.000 TL (Blokeli)</w:t>
-      </w:r>
-    </w:p>
-    <w:p>
-      <w:r>
-        <w:t xml:space="preserve">    * Başkan: 3.500.001 TL - 7.500.000 TL (Blokesiz) | 18.500.001 TL - 37.500.000 TL (Blokeli)</w:t>
-      </w:r>
-    </w:p>
-    <w:p>
-      <w:r>
-        <w:t xml:space="preserve">    * Genel Müdür Yrd.: 7.500.001 TL - 15.000.000 TL (Blokesiz) | 37.500.001 TL - 75.000.000 TL (Blokeli)</w:t>
-      </w:r>
-    </w:p>
-    <w:p>
-      <w:r>
-        <w:t xml:space="preserve">    * Genel Müdür: 15.000.001 TL Üstü (Blokesiz) | 75.000.001 TL Üstü (Blokeli)</w:t>
-      </w:r>
-    </w:p>
-    <w:p/>
-    <w:p>
-      <w:r>
-        <w:t>* 3.3. Yeniden Değerlendirme Şartları:</w:t>
+        <w:t xml:space="preserve">  - Bir üye işyeri aynı anda hem VakıfBank Üye İşyeri hem de VakıfBank World Üye İşyeri OLAMAZ.</w:t>
+      </w:r>
+    </w:p>
+    <w:p>
+      <w:r>
+        <w:t xml:space="preserve">  - 6 AY KURALI: YKB'nin World POS'unu kullandığı halde Bankamızdan World POS talep eden işyerlerine, YKB World üye işyeri iptali yapıldıktan 6 AY SONRA Bankamız World POS'u tahsis edilebilir.</w:t>
+      </w:r>
+    </w:p>
+    <w:p>
+      <w:r>
+        <w:t xml:space="preserve">  - İSTİSNALAR: Birden fazla şubesi olan firmaların YKB World POS'u bulunmayan noktalarına World POS verilebilir; YKB World POS'u olan işyerine World özelliği bulunmayan VakıfBank Üye İşyeri POS'u verilebilir; taksit yapan KAMU kapsamındaki üye işyerlerinde Worldpuan uygulaması zorunlu değildir.</w:t>
+      </w:r>
+    </w:p>
+    <w:p/>
+    <w:p>
+      <w:r>
+        <w:t>* Kartlı Ödeme Sistemleri Kuruluşları:</w:t>
+      </w:r>
+    </w:p>
+    <w:p>
+      <w:r>
+        <w:t xml:space="preserve">  - Bankamız POS'larında Kabul Edilen 5 Kuruluş: Visa, Mastercard, American Express, Troy, China Union Pay.</w:t>
+      </w:r>
+    </w:p>
+    <w:p>
+      <w:r>
+        <w:t xml:space="preserve">  - Kabul Edilmeyenler: JCB ve Diners Club kartları Bankamız POS cihazlarından KABUL EDİLMEMEKTEDİR.</w:t>
+      </w:r>
+    </w:p>
+    <w:p/>
+    <w:p>
+      <w:r>
+        <w:t>* Üye İşyerlerinden Gelir Elde Etme:</w:t>
+      </w:r>
+    </w:p>
+    <w:p>
+      <w:r>
+        <w:t xml:space="preserve">  - Tek ödeme işlemlerde uygulanan komisyon/bloke gün getirisi ile BKM Takas komisyonu arasındaki fark; taksitli işlemlerde ise ortalama vade üzerinden FTF oranı baz alınarak hesaplanan maliyet ile çalışma koşulları arasındaki fark gelir yaratır.</w:t>
+      </w:r>
+    </w:p>
+    <w:p/>
+    <w:p>
+      <w:r>
+        <w:t>* Üye İşyeri POS Türleri ve Ürünleri:</w:t>
+      </w:r>
+    </w:p>
+    <w:p>
+      <w:r>
+        <w:t xml:space="preserve">  - Mobil/GSM/GPRS POS: Satışlarını müşteri adresinde yapan firmalarda (toptancılar vb.) kullanılır.</w:t>
+      </w:r>
+    </w:p>
+    <w:p>
+      <w:r>
+        <w:t xml:space="preserve">  - Sanal POS (VPOS): Web sitesi üzerinden online satışlar içindir, fiziki cihaz yoktur; risk ihtimaline karşı işyerinin BLOKELİ çalışması tercih edilir.</w:t>
+      </w:r>
+    </w:p>
+    <w:p>
+      <w:r>
+        <w:t xml:space="preserve">  - IP/ADSL POS: Yoğun işlem yapan işyerlerinde internet bağlantısı ile hızlı ve düşük maliyetli çalışır.</w:t>
+      </w:r>
+    </w:p>
+    <w:p>
+      <w:r>
+        <w:t xml:space="preserve">  - Mail-Order POS: Kart fiziki olarak bulunmadan POS tuş takımı ile kart bilgilerinin girilmesidir (telefon/faks siparişleri); riskli olduğundan VALÖRLÜ çalışma koşulu tavsiye edilir.</w:t>
       </w:r>
     </w:p>
     <w:p>
       <w:r>
         <w:lastRenderedPageBreak/>
-        <w:t xml:space="preserve">  - Müşterinin açık takibi olmamalı, başvuru/limit talebi SON 1 AY içerisinde yapılmış olmalı ve gerekçe açıkça belirtilmelidir.</w:t>
-      </w:r>
-    </w:p>
-    <w:p/>
-    <w:p>
-      <w:r>
-        <w:t>* 4. Operasyonel İşlemler, İtiraz Süreleri ve Kurallar:</w:t>
-      </w:r>
-    </w:p>
-    <w:p>
-      <w:r>
-        <w:t xml:space="preserve">  - 5464 Sayılı Kanun Zorunlu Süreleri: Kredi kartı iptalleri talep tarihinden itibaren 7 GÜN içinde gerçekleştirilmeli; müşteri itirazları 20 GÜN içinde yanıtlanmalıdır.</w:t>
-      </w:r>
-    </w:p>
-    <w:p>
-      <w:r>
-        <w:t xml:space="preserve">  - 4.1. Kart Ücreti İtirazları: VIT "Kart Aidat İtirazı Yap" menüsünden değerlendirilir, müşteriye bilgi verilir ve AYRICA KAYIT ALINMAZ.</w:t>
-      </w:r>
-    </w:p>
-    <w:p>
-      <w:r>
-        <w:t xml:space="preserve">  - 4.2. Nakit Çekim ve Harcama İtirazları:</w:t>
-      </w:r>
-    </w:p>
-    <w:p>
-      <w:r>
-        <w:t xml:space="preserve">    * Kart Hamili İtiraz Süresi: İşlemlere itiraz etme süresi EN FAZLA 120 GÜNDÜR (bilgilendirmeyi Kartlı Sistemler Takas İşlemleri Müdürlüğü yapar).</w:t>
-      </w:r>
-    </w:p>
-    <w:p>
-      <w:r>
-        <w:t xml:space="preserve">    * Üye İşyeri ve ATM İtirazları: VIT üzerinden şubelere iletilen kaydın cevaplanma süresi ORTALAMA 5 İŞ GÜNÜDÜR; süresinde dönüş yapılmazsa üye işyeri aleyhine sonuçlanır ve firma hesabından tahsil edilir.</w:t>
-      </w:r>
-    </w:p>
-    <w:p>
-      <w:r>
-        <w:t xml:space="preserve">  - 4.3. Artı Bakiye Transferleri: VIT "Kredi Kartı Artı Bakiye Transferi" ekranından kart statüsü ve para birimi (TL/USD) ayrımı olmaksızın çekilir. Sistem reddederse VIT Müşteri Talep Yönetimi'nden Kartlı Sistemler Müşteri Hizmetleri Müdürlüğüne kayıt açılır; çözüm süresi AZAMİ 3 İŞ GÜNÜDÜR.</w:t>
-      </w:r>
-    </w:p>
-    <w:p>
-      <w:r>
-        <w:t xml:space="preserve">  - 4.4. Kart İptali: Şubeler aynı gün VIT "Kart İptal Talebi Al" ekranından işleme alır; ancak TARIM KARTLARIN İPTALİ İÇİN Müşteri Talep Yönetiminden kayıt açılmalıdır.</w:t>
-      </w:r>
-    </w:p>
-    <w:p>
-      <w:r>
-        <w:t xml:space="preserve">  - 4.6. Asgari Ödeme Oranları:</w:t>
-      </w:r>
-    </w:p>
-    <w:p>
-      <w:r>
-        <w:t xml:space="preserve">    * Bireysel Kredi Kartı: Limit 50.000 TL altında ise %20 | 50.000 TL üzeri ise %40</w:t>
-      </w:r>
-    </w:p>
-    <w:p>
-      <w:r>
-        <w:t xml:space="preserve">    * Ticari Kredi Kartı: Limit 5 Milyon TL'ye kadar ise %40 | 5 Milyon TL ve üzeri ise %50</w:t>
-      </w:r>
-    </w:p>
-    <w:p>
-      <w:r>
-        <w:t xml:space="preserve">    * Tarım Kartlar: %70</w:t>
-      </w:r>
-    </w:p>
-    <w:p>
-      <w:r>
-        <w:t xml:space="preserve">    * Mal/hizmet alımları ve nakit çekimlerde taksitlendirme süreleri; Cumhurbaşkanlığı Strateji ve Bütçe Başkanlığı, Hazine ve Maliye Bakanlığı ile Ticaret Bakanlığının görüşü alınarak BDDK (Kurul) tarafından belirlenir.</w:t>
-      </w:r>
-    </w:p>
-    <w:p>
-      <w:r>
-        <w:t xml:space="preserve">  - 4.7. Kayıp/Çalıntı Sorumluluğu: Bildirimden önceki 24 SAAT İÇİNDE gerçekleşen hukuka aykırı kullanımdan doğan zararlardan kart hamili 150 TL İLE SINIRLI olmak üzere sorumludur; 24 saatten önce gerçekleşen işlemlerden kendisi sorumludur.</w:t>
-      </w:r>
-    </w:p>
-    <w:p>
-      <w:r>
-        <w:t xml:space="preserve">  - 4.8. Yabancı Para (USD) Harcama ve Ödeme: Son ödeme tarihinde ödenmeyen/eksik ödenen USD borcu, SON ÖDEME TARİHİNDEN 1 İŞ GÜNÜ ÖNCEKİ TCMB DÖVİZ SATIŞ </w:t>
-      </w:r>
-      <w:r>
-        <w:lastRenderedPageBreak/>
-        <w:t>KURUNA %1 EKLENEREK TL'ye çevrilir ve hesap kesim tarihi valörüyle TL hesabına borç kaydedilir (son ödeme tarihi geçtikten sonra ödeme USD değil TL cinsinden yapılmalıdır).</w:t>
-      </w:r>
-    </w:p>
-    <w:p>
-      <w:r>
-        <w:t xml:space="preserve">  - 4.9. Para Yatırma: Kredi kartı limiti para yatırıldığı ANDA açılır; ek karta yapılan ödeme GÜN SONU itibarıyla asıl kart hesabına geçer.</w:t>
-      </w:r>
-    </w:p>
-    <w:p>
-      <w:r>
-        <w:t xml:space="preserve">  - 4.11. Kart Dağıtım Kurye Ayrımı: Müşterilerin ev/iş adreslerine gönderilen kartlar KURYENET / AGT / PTT ile; şubelerimize gönderilmek üzere basılan kartlar ise DHL KARGO tarafından gönderilir.</w:t>
-      </w:r>
-    </w:p>
-    <w:p/>
-    <w:p/>
-    <w:p>
-      <w:r>
-        <w:t>5. ÜYE İŞYERİ YAPISI, TAKAS, WORLD MARKA PAYLAŞIMI VE POS TÜRLERİ</w:t>
-      </w:r>
-    </w:p>
-    <w:p>
-      <w:r>
-        <w:t>--------------------------------------------------------------------------------</w:t>
-      </w:r>
-    </w:p>
-    <w:p>
-      <w:r>
-        <w:t>* 6. Üye İşyeri Takas Mekanizması:</w:t>
-      </w:r>
-    </w:p>
-    <w:p>
-      <w:r>
-        <w:t xml:space="preserve">  - Takas Komisyonu BKM tarafından aylık olarak belirlenir.</w:t>
-      </w:r>
-    </w:p>
-    <w:p>
-      <w:r>
-        <w:t xml:space="preserve">  - KURAL: Takas komisyonunu ÜYE İŞYERİ SAHİBİ BANKA (Acquirer), KART SAHİBİ BANKAYA (Issuer) öder.</w:t>
-      </w:r>
-    </w:p>
-    <w:p>
-      <w:r>
-        <w:t xml:space="preserve">  - Yurt içi takasta BKM ve TCMB yer alırken; yurt dışı takasta BKM ile birlikte Visa / MasterCard devreye girer.</w:t>
-      </w:r>
-    </w:p>
-    <w:p/>
-    <w:p>
-      <w:r>
-        <w:t>* 7. Üye İşyeri Çalışma Şartlarımız:</w:t>
-      </w:r>
-    </w:p>
-    <w:p>
-      <w:r>
-        <w:t xml:space="preserve">  - Tek Ödeme İşlemler: Komisyonlu (ertesi gün komisyon kesilerek), Valörlü (valör süresi beklenip komisyonsuz) veya Valör + Komisyonlu.</w:t>
-      </w:r>
-    </w:p>
-    <w:p>
-      <w:r>
-        <w:t xml:space="preserve">  - Taksitli İşlemler:</w:t>
-      </w:r>
-    </w:p>
-    <w:p>
-      <w:r>
-        <w:t xml:space="preserve">    * İskontolu İşlemler: Ertesi gün komisyonlu olarak işyeri hesabına yatırılır.</w:t>
-      </w:r>
-    </w:p>
-    <w:p>
-      <w:r>
-        <w:t xml:space="preserve">    * Valörlü İşlemler: İşyeri hesabına İLK TAKSİT 40 GÜN, takip eden taksitler de 40'AR GÜNLÜK PERİYOTLAR halinde yatırılır; ayrıca TİK (taksitli işlem komisyonu) tahsil edilmez.</w:t>
-      </w:r>
-    </w:p>
-    <w:p>
-      <w:r>
-        <w:t xml:space="preserve">  - İNCE NOKTA: Bankamız Ticari Kredi Kartları artı taksit kampanyalarından FAYDALANDIRILMAMAKTADIR. Ticari kartlarda sektörel taksit kısıtı uygulanmaz, genel taksit sınırına tabidir.</w:t>
-      </w:r>
-    </w:p>
-    <w:p/>
-    <w:p>
-      <w:r>
-        <w:t>* 8. World Marka Paylaşımı ve 9. Üye İşyeri Yapısı:</w:t>
-      </w:r>
-    </w:p>
-    <w:p>
-      <w:r>
-        <w:lastRenderedPageBreak/>
-        <w:t xml:space="preserve">  - Bankamız ile YKB arasındaki World anlaşması gereği BKM takas komisyon oranının altında bir takas komisyonu uygulanır.</w:t>
-      </w:r>
-    </w:p>
-    <w:p>
-      <w:r>
-        <w:t xml:space="preserve">  - PARAGRAF SONU TUZAĞI: Sadece YKB World Kartlar, VakıfBank World POS'larında World özellikli kabul edilir; AL BARAKA ve ANADOLUBANK World kartları VakıfBank World POS'larında World özellikli olarak KABUL EDİLEMEMEKTEDİR.</w:t>
-      </w:r>
-    </w:p>
-    <w:p>
-      <w:r>
-        <w:t xml:space="preserve">  - Bir üye işyeri aynı anda hem VakıfBank Üye İşyeri hem de VakıfBank World Üye İşyeri OLAMAZ.</w:t>
-      </w:r>
-    </w:p>
-    <w:p>
-      <w:r>
-        <w:t xml:space="preserve">  - 6 AY KURALI: YKB'nin World POS'unu kullandığı halde Bankamızdan World POS talep eden işyerlerine, YKB World üye işyeri iptali yapıldıktan 6 AY SONRA Bankamız World POS'u tahsis edilebilir.</w:t>
-      </w:r>
-    </w:p>
-    <w:p>
-      <w:r>
-        <w:t xml:space="preserve">  - İSTİSNALAR: Birden fazla şubesi olan firmaların YKB World POS'u bulunmayan noktalarına World POS verilebilir; YKB World POS'u olan işyerine World özelliği bulunmayan VakıfBank Üye İşyeri POS'u verilebilir; taksit yapan KAMU kapsamındaki üye işyerlerinde Worldpuan uygulaması zorunlu değildir.</w:t>
-      </w:r>
-    </w:p>
-    <w:p/>
-    <w:p>
-      <w:r>
-        <w:t>* 10. Kartlı Ödeme Sistemleri Kuruluşları:</w:t>
-      </w:r>
-    </w:p>
-    <w:p>
-      <w:r>
-        <w:t xml:space="preserve">  - Bankamız POS'larında Kabul Edilen 5 Kuruluş: Visa, Mastercard, American Express, Troy, China Union Pay.</w:t>
-      </w:r>
-    </w:p>
-    <w:p>
-      <w:r>
-        <w:t xml:space="preserve">  - Kabul Edilmeyenler: JCB ve Diners Club kartları Bankamız POS cihazlarından KABUL EDİLMEMEKTEDİR.</w:t>
-      </w:r>
-    </w:p>
-    <w:p/>
-    <w:p>
-      <w:r>
-        <w:t>* 11. Üye İşyerlerinden Gelir Elde Etme:</w:t>
-      </w:r>
-    </w:p>
-    <w:p>
-      <w:r>
-        <w:t xml:space="preserve">  - Tek ödeme işlemlerde uygulanan komisyon/bloke gün getirisi ile BKM Takas komisyonu arasındaki fark; taksitli işlemlerde ise ortalama vade üzerinden FTF oranı baz alınarak hesaplanan maliyet ile çalışma koşulları arasındaki fark gelir yaratır.</w:t>
-      </w:r>
-    </w:p>
-    <w:p/>
-    <w:p>
-      <w:r>
-        <w:t>* 12. Üye İşyeri POS Türleri ve Ürünleri:</w:t>
-      </w:r>
-    </w:p>
-    <w:p>
-      <w:r>
-        <w:t xml:space="preserve">  - Mobil/GSM/GPRS POS: Satışlarını müşteri adresinde yapan firmalarda (toptancılar vb.) kullanılır.</w:t>
-      </w:r>
-    </w:p>
-    <w:p>
-      <w:r>
-        <w:t xml:space="preserve">  - Sanal POS (VPOS): Web sitesi üzerinden online satışlar içindir, fiziki cihaz yoktur; risk ihtimaline karşı işyerinin BLOKELİ çalışması tercih edilir.</w:t>
-      </w:r>
-    </w:p>
-    <w:p>
-      <w:r>
-        <w:t xml:space="preserve">  - IP/ADSL POS: Yoğun işlem yapan işyerlerinde internet bağlantısı ile hızlı ve düşük maliyetli çalışır.</w:t>
-      </w:r>
-    </w:p>
-    <w:p>
-      <w:r>
-        <w:lastRenderedPageBreak/>
-        <w:t xml:space="preserve">  - Mail-Order POS: Kart fiziki olarak bulunmadan POS tuş takımı ile kart bilgilerinin girilmesidir (telefon/faks siparişleri); riskli olduğundan VALÖRLÜ çalışma koşulu tavsiye edilir.</w:t>
-      </w:r>
-    </w:p>
-    <w:p>
-      <w:r>
         <w:t xml:space="preserve">  - Linkle Tahsilat POS (VPOS): Entegrasyona gerek kalmadan oluşturulan ödeme linkinin SMS, E-posta, WhatsApp vb. ile alıcıya gönderilmesidir; sadece 3D SECURE güvenliği altında çalışır, NON-SECURE (3D şifresiz) işlem tipi DESTEKLENMEMEKTEDİR.</w:t>
       </w:r>
     </w:p>

</xml_diff>